<commit_message>
Practice sample: Level 3 lesson 3 (16 items, solutions, slips, variants, verified)
Co-Authored-By: Claude Sonnet 5.5 <noreply@anthropic.com>
Claude-Session: https://claude.ai/code/session_01Wmstm4fTDLXm5Z35vo5Mv2
</commit_message>
<xml_diff>
--- a/hp/Math_Inquirers_Weekly_Email_Pack.docx
+++ b/hp/Math_Inquirers_Weekly_Email_Pack.docx
@@ -163,7 +163,7 @@
           <w:b w:val="0"/>
           <w:i w:val="0"/>
         </w:rPr>
-        <w:t>Cut-out kit pages (ten-frames, counters, number strips) are at the end of the week 1 PDF. Please cut them out and keep them in one envelope; we use them every week.</w:t>
+        <w:t>Cut-out kit pages (ten-frames, counters, number strips) are at the end of the week 1 PDF. Please cut them out and keep them in one envelope; we use them every week. Before Lesson 1, please cut out the two rows of the number strip (0 to 50) and tape them end to end, so we do not spend class time cutting.</w:t>
       </w:r>
     </w:p>
     <w:p>
@@ -1011,7 +1011,7 @@
           <w:b w:val="0"/>
           <w:i w:val="0"/>
         </w:rPr>
-        <w:t>The paper cube strips are on the cut-outs page (included again in the week 5 PDF). The Certificate of Completion is the last page.</w:t>
+        <w:t>The paper cube strips are on the cut-outs page (included again in the week 5 PDF). Before Lesson 9, please print that page and cut out Strip A, so we do not spend class time cutting. The Certificate of Completion is the last page.</w:t>
       </w:r>
     </w:p>
     <w:p>

</xml_diff>

<commit_message>
Level 1: replace readiness tracker and screening set with plain Progress Notes
Co-Authored-By: Claude Sonnet 5.5 <noreply@anthropic.com>
Claude-Session: https://claude.ai/code/session_01NYgB3ju57UwWRpkPPM6X7F
</commit_message>
<xml_diff>
--- a/hp/Math_Inquirers_Weekly_Email_Pack.docx
+++ b/hp/Math_Inquirers_Weekly_Email_Pack.docx
@@ -268,11 +268,11 @@
         </w:rPr>
         <w:t>Before the lesson, please:</w:t>
         <w:br/>
-        <w:t xml:space="preserve">  1. Read both scripts once and try the Challenge questions yourself.</w:t>
+        <w:t xml:space="preserve">  1. Read both scripts once and try the Go further questions yourself.</w:t>
         <w:br/>
         <w:t xml:space="preserve">  2. Check you have counters, coins and cut-outs ready (see the materials list in the guide).</w:t>
         <w:br/>
-        <w:t xml:space="preserve">  3. After each lesson, tick the Readiness Tracker for each child (four quick ticks) and send me the sheet.</w:t>
+        <w:t xml:space="preserve">  3. After each lesson, fill in the Progress Notes for each child (30 seconds each) and send me the sheet.</w:t>
       </w:r>
     </w:p>
     <w:p>
@@ -480,11 +480,11 @@
         </w:rPr>
         <w:t>Before the lesson, please:</w:t>
         <w:br/>
-        <w:t xml:space="preserve">  1. Read both scripts once and try the Challenge questions yourself.</w:t>
+        <w:t xml:space="preserve">  1. Read both scripts once and try the Go further questions yourself.</w:t>
         <w:br/>
         <w:t xml:space="preserve">  2. Check you have counters, coins and cut-outs ready (see the materials list in the guide).</w:t>
         <w:br/>
-        <w:t xml:space="preserve">  3. After each lesson, tick the Readiness Tracker for each child (four quick ticks) and send me the sheet.</w:t>
+        <w:t xml:space="preserve">  3. After each lesson, fill in the Progress Notes for each child (30 seconds each) and send me the sheet.</w:t>
       </w:r>
     </w:p>
     <w:p>
@@ -692,11 +692,11 @@
         </w:rPr>
         <w:t>Before the lesson, please:</w:t>
         <w:br/>
-        <w:t xml:space="preserve">  1. Read both scripts once and try the Challenge questions yourself.</w:t>
+        <w:t xml:space="preserve">  1. Read both scripts once and try the Go further questions yourself.</w:t>
         <w:br/>
         <w:t xml:space="preserve">  2. Check you have counters, coins and cut-outs ready (see the materials list in the guide).</w:t>
         <w:br/>
-        <w:t xml:space="preserve">  3. After each lesson, tick the Readiness Tracker for each child (four quick ticks) and send me the sheet.</w:t>
+        <w:t xml:space="preserve">  3. After each lesson, fill in the Progress Notes for each child (30 seconds each) and send me the sheet.</w:t>
       </w:r>
     </w:p>
     <w:p>
@@ -904,11 +904,11 @@
         </w:rPr>
         <w:t>Before the lesson, please:</w:t>
         <w:br/>
-        <w:t xml:space="preserve">  1. Read both scripts once and try the Challenge questions yourself.</w:t>
+        <w:t xml:space="preserve">  1. Read both scripts once and try the Go further questions yourself.</w:t>
         <w:br/>
         <w:t xml:space="preserve">  2. Check you have counters, coins and cut-outs ready (see the materials list in the guide).</w:t>
         <w:br/>
-        <w:t xml:space="preserve">  3. After each lesson, tick the Readiness Tracker for each child (four quick ticks) and send me the sheet.</w:t>
+        <w:t xml:space="preserve">  3. After each lesson, fill in the Progress Notes for each child (30 seconds each) and send me the sheet.</w:t>
       </w:r>
     </w:p>
     <w:p>
@@ -1116,11 +1116,11 @@
         </w:rPr>
         <w:t>Before the lesson, please:</w:t>
         <w:br/>
-        <w:t xml:space="preserve">  1. Read both scripts once and try the Challenge questions yourself.</w:t>
+        <w:t xml:space="preserve">  1. Read both scripts once and try the Go further questions yourself.</w:t>
         <w:br/>
         <w:t xml:space="preserve">  2. Check you have counters, coins and cut-outs ready (see the materials list in the guide).</w:t>
         <w:br/>
-        <w:t xml:space="preserve">  3. After each lesson, tick the Readiness Tracker for each child (four quick ticks) and send me the sheet.</w:t>
+        <w:t xml:space="preserve">  3. After each lesson, fill in the Progress Notes for each child (30 seconds each) and send me the sheet.</w:t>
       </w:r>
     </w:p>
     <w:p>

</xml_diff>